<commit_message>
vault backup: 2026-02-24 16:06:25
</commit_message>
<xml_diff>
--- a/Materias/Diseño de sistemas/Material/TP1/Flujos de sucesos/CU2 - Aceptar convenio/CU - Aceptar convenio.docx
+++ b/Materias/Diseño de sistemas/Material/TP1/Flujos de sucesos/CU2 - Aceptar convenio/CU - Aceptar convenio.docx
@@ -8643,9 +8643,7 @@
       <w:tblStyleRowBandSize w:val="1"/>
       <w:tblStyleColBandSize w:val="1"/>
       <w:tblCellMar>
-        <w:top w:w="0" w:type="dxa"/>
         <w:left w:w="108" w:type="dxa"/>
-        <w:bottom w:w="0" w:type="dxa"/>
         <w:right w:w="108" w:type="dxa"/>
       </w:tblCellMar>
     </w:tblPr>
@@ -8659,9 +8657,7 @@
       <w:tblStyleRowBandSize w:val="1"/>
       <w:tblStyleColBandSize w:val="1"/>
       <w:tblCellMar>
-        <w:top w:w="0" w:type="dxa"/>
         <w:left w:w="108" w:type="dxa"/>
-        <w:bottom w:w="0" w:type="dxa"/>
         <w:right w:w="108" w:type="dxa"/>
       </w:tblCellMar>
     </w:tblPr>
@@ -8675,9 +8671,7 @@
       <w:tblStyleRowBandSize w:val="1"/>
       <w:tblStyleColBandSize w:val="1"/>
       <w:tblCellMar>
-        <w:top w:w="0" w:type="dxa"/>
         <w:left w:w="108" w:type="dxa"/>
-        <w:bottom w:w="0" w:type="dxa"/>
         <w:right w:w="108" w:type="dxa"/>
       </w:tblCellMar>
     </w:tblPr>
@@ -8691,9 +8685,7 @@
       <w:tblStyleRowBandSize w:val="1"/>
       <w:tblStyleColBandSize w:val="1"/>
       <w:tblCellMar>
-        <w:top w:w="0" w:type="dxa"/>
         <w:left w:w="108" w:type="dxa"/>
-        <w:bottom w:w="0" w:type="dxa"/>
         <w:right w:w="108" w:type="dxa"/>
       </w:tblCellMar>
     </w:tblPr>
@@ -8707,9 +8699,7 @@
       <w:tblStyleRowBandSize w:val="1"/>
       <w:tblStyleColBandSize w:val="1"/>
       <w:tblCellMar>
-        <w:top w:w="0" w:type="dxa"/>
         <w:left w:w="108" w:type="dxa"/>
-        <w:bottom w:w="0" w:type="dxa"/>
         <w:right w:w="108" w:type="dxa"/>
       </w:tblCellMar>
     </w:tblPr>
@@ -8723,9 +8713,7 @@
       <w:tblStyleRowBandSize w:val="1"/>
       <w:tblStyleColBandSize w:val="1"/>
       <w:tblCellMar>
-        <w:top w:w="0" w:type="dxa"/>
         <w:left w:w="108" w:type="dxa"/>
-        <w:bottom w:w="0" w:type="dxa"/>
         <w:right w:w="108" w:type="dxa"/>
       </w:tblCellMar>
     </w:tblPr>
@@ -8735,12 +8723,6 @@
     <w:tblPr>
       <w:tblStyleRowBandSize w:val="1"/>
       <w:tblStyleColBandSize w:val="1"/>
-      <w:tblCellMar>
-        <w:top w:w="0" w:type="dxa"/>
-        <w:left w:w="0" w:type="dxa"/>
-        <w:bottom w:w="0" w:type="dxa"/>
-        <w:right w:w="0" w:type="dxa"/>
-      </w:tblCellMar>
     </w:tblPr>
   </w:style>
   <w:style w:type="table" w:customStyle="1" w:styleId="a6">
@@ -8748,12 +8730,6 @@
     <w:tblPr>
       <w:tblStyleRowBandSize w:val="1"/>
       <w:tblStyleColBandSize w:val="1"/>
-      <w:tblCellMar>
-        <w:top w:w="0" w:type="dxa"/>
-        <w:left w:w="0" w:type="dxa"/>
-        <w:bottom w:w="0" w:type="dxa"/>
-        <w:right w:w="0" w:type="dxa"/>
-      </w:tblCellMar>
     </w:tblPr>
   </w:style>
   <w:style w:type="table" w:customStyle="1" w:styleId="a7">
@@ -8761,12 +8737,6 @@
     <w:tblPr>
       <w:tblStyleRowBandSize w:val="1"/>
       <w:tblStyleColBandSize w:val="1"/>
-      <w:tblCellMar>
-        <w:top w:w="0" w:type="dxa"/>
-        <w:left w:w="0" w:type="dxa"/>
-        <w:bottom w:w="0" w:type="dxa"/>
-        <w:right w:w="0" w:type="dxa"/>
-      </w:tblCellMar>
     </w:tblPr>
   </w:style>
   <w:style w:type="table" w:customStyle="1" w:styleId="a8">
@@ -8774,12 +8744,6 @@
     <w:tblPr>
       <w:tblStyleRowBandSize w:val="1"/>
       <w:tblStyleColBandSize w:val="1"/>
-      <w:tblCellMar>
-        <w:top w:w="0" w:type="dxa"/>
-        <w:left w:w="0" w:type="dxa"/>
-        <w:bottom w:w="0" w:type="dxa"/>
-        <w:right w:w="0" w:type="dxa"/>
-      </w:tblCellMar>
     </w:tblPr>
   </w:style>
   <w:style w:type="table" w:customStyle="1" w:styleId="a9">
@@ -8791,9 +8755,7 @@
       <w:tblStyleRowBandSize w:val="1"/>
       <w:tblStyleColBandSize w:val="1"/>
       <w:tblCellMar>
-        <w:top w:w="0" w:type="dxa"/>
         <w:left w:w="108" w:type="dxa"/>
-        <w:bottom w:w="0" w:type="dxa"/>
         <w:right w:w="108" w:type="dxa"/>
       </w:tblCellMar>
     </w:tblPr>
@@ -8807,9 +8769,7 @@
       <w:tblStyleRowBandSize w:val="1"/>
       <w:tblStyleColBandSize w:val="1"/>
       <w:tblCellMar>
-        <w:top w:w="0" w:type="dxa"/>
         <w:left w:w="108" w:type="dxa"/>
-        <w:bottom w:w="0" w:type="dxa"/>
         <w:right w:w="108" w:type="dxa"/>
       </w:tblCellMar>
     </w:tblPr>
@@ -8823,9 +8783,7 @@
       <w:tblStyleRowBandSize w:val="1"/>
       <w:tblStyleColBandSize w:val="1"/>
       <w:tblCellMar>
-        <w:top w:w="0" w:type="dxa"/>
         <w:left w:w="108" w:type="dxa"/>
-        <w:bottom w:w="0" w:type="dxa"/>
         <w:right w:w="108" w:type="dxa"/>
       </w:tblCellMar>
     </w:tblPr>
@@ -8839,9 +8797,7 @@
       <w:tblStyleRowBandSize w:val="1"/>
       <w:tblStyleColBandSize w:val="1"/>
       <w:tblCellMar>
-        <w:top w:w="0" w:type="dxa"/>
         <w:left w:w="108" w:type="dxa"/>
-        <w:bottom w:w="0" w:type="dxa"/>
         <w:right w:w="108" w:type="dxa"/>
       </w:tblCellMar>
     </w:tblPr>
@@ -8855,9 +8811,7 @@
       <w:tblStyleRowBandSize w:val="1"/>
       <w:tblStyleColBandSize w:val="1"/>
       <w:tblCellMar>
-        <w:top w:w="0" w:type="dxa"/>
         <w:left w:w="108" w:type="dxa"/>
-        <w:bottom w:w="0" w:type="dxa"/>
         <w:right w:w="108" w:type="dxa"/>
       </w:tblCellMar>
     </w:tblPr>
@@ -8871,9 +8825,7 @@
       <w:tblStyleRowBandSize w:val="1"/>
       <w:tblStyleColBandSize w:val="1"/>
       <w:tblCellMar>
-        <w:top w:w="0" w:type="dxa"/>
         <w:left w:w="108" w:type="dxa"/>
-        <w:bottom w:w="0" w:type="dxa"/>
         <w:right w:w="108" w:type="dxa"/>
       </w:tblCellMar>
     </w:tblPr>
@@ -8887,9 +8839,7 @@
       <w:tblStyleRowBandSize w:val="1"/>
       <w:tblStyleColBandSize w:val="1"/>
       <w:tblCellMar>
-        <w:top w:w="0" w:type="dxa"/>
         <w:left w:w="108" w:type="dxa"/>
-        <w:bottom w:w="0" w:type="dxa"/>
         <w:right w:w="108" w:type="dxa"/>
       </w:tblCellMar>
     </w:tblPr>
@@ -8903,9 +8853,7 @@
       <w:tblStyleRowBandSize w:val="1"/>
       <w:tblStyleColBandSize w:val="1"/>
       <w:tblCellMar>
-        <w:top w:w="0" w:type="dxa"/>
         <w:left w:w="108" w:type="dxa"/>
-        <w:bottom w:w="0" w:type="dxa"/>
         <w:right w:w="108" w:type="dxa"/>
       </w:tblCellMar>
     </w:tblPr>
@@ -8916,9 +8864,7 @@
       <w:tblStyleRowBandSize w:val="1"/>
       <w:tblStyleColBandSize w:val="1"/>
       <w:tblCellMar>
-        <w:top w:w="0" w:type="dxa"/>
         <w:left w:w="115" w:type="dxa"/>
-        <w:bottom w:w="0" w:type="dxa"/>
         <w:right w:w="115" w:type="dxa"/>
       </w:tblCellMar>
     </w:tblPr>
@@ -8929,9 +8875,7 @@
       <w:tblStyleRowBandSize w:val="1"/>
       <w:tblStyleColBandSize w:val="1"/>
       <w:tblCellMar>
-        <w:top w:w="0" w:type="dxa"/>
         <w:left w:w="115" w:type="dxa"/>
-        <w:bottom w:w="0" w:type="dxa"/>
         <w:right w:w="115" w:type="dxa"/>
       </w:tblCellMar>
     </w:tblPr>
@@ -8942,9 +8886,7 @@
       <w:tblStyleRowBandSize w:val="1"/>
       <w:tblStyleColBandSize w:val="1"/>
       <w:tblCellMar>
-        <w:top w:w="0" w:type="dxa"/>
         <w:left w:w="115" w:type="dxa"/>
-        <w:bottom w:w="0" w:type="dxa"/>
         <w:right w:w="115" w:type="dxa"/>
       </w:tblCellMar>
     </w:tblPr>
@@ -8955,9 +8897,7 @@
       <w:tblStyleRowBandSize w:val="1"/>
       <w:tblStyleColBandSize w:val="1"/>
       <w:tblCellMar>
-        <w:top w:w="0" w:type="dxa"/>
         <w:left w:w="115" w:type="dxa"/>
-        <w:bottom w:w="0" w:type="dxa"/>
         <w:right w:w="115" w:type="dxa"/>
       </w:tblCellMar>
     </w:tblPr>
@@ -8971,9 +8911,7 @@
       <w:tblStyleRowBandSize w:val="1"/>
       <w:tblStyleColBandSize w:val="1"/>
       <w:tblCellMar>
-        <w:top w:w="0" w:type="dxa"/>
         <w:left w:w="108" w:type="dxa"/>
-        <w:bottom w:w="0" w:type="dxa"/>
         <w:right w:w="108" w:type="dxa"/>
       </w:tblCellMar>
     </w:tblPr>
@@ -8987,9 +8925,7 @@
       <w:tblStyleRowBandSize w:val="1"/>
       <w:tblStyleColBandSize w:val="1"/>
       <w:tblCellMar>
-        <w:top w:w="0" w:type="dxa"/>
         <w:left w:w="108" w:type="dxa"/>
-        <w:bottom w:w="0" w:type="dxa"/>
         <w:right w:w="108" w:type="dxa"/>
       </w:tblCellMar>
     </w:tblPr>
@@ -9003,9 +8939,7 @@
       <w:tblStyleRowBandSize w:val="1"/>
       <w:tblStyleColBandSize w:val="1"/>
       <w:tblCellMar>
-        <w:top w:w="0" w:type="dxa"/>
         <w:left w:w="108" w:type="dxa"/>
-        <w:bottom w:w="0" w:type="dxa"/>
         <w:right w:w="108" w:type="dxa"/>
       </w:tblCellMar>
     </w:tblPr>
@@ -9019,9 +8953,7 @@
       <w:tblStyleRowBandSize w:val="1"/>
       <w:tblStyleColBandSize w:val="1"/>
       <w:tblCellMar>
-        <w:top w:w="0" w:type="dxa"/>
         <w:left w:w="108" w:type="dxa"/>
-        <w:bottom w:w="0" w:type="dxa"/>
         <w:right w:w="108" w:type="dxa"/>
       </w:tblCellMar>
     </w:tblPr>
@@ -9035,9 +8967,7 @@
       <w:tblStyleRowBandSize w:val="1"/>
       <w:tblStyleColBandSize w:val="1"/>
       <w:tblCellMar>
-        <w:top w:w="0" w:type="dxa"/>
         <w:left w:w="108" w:type="dxa"/>
-        <w:bottom w:w="0" w:type="dxa"/>
         <w:right w:w="108" w:type="dxa"/>
       </w:tblCellMar>
     </w:tblPr>
@@ -9051,9 +8981,7 @@
       <w:tblStyleRowBandSize w:val="1"/>
       <w:tblStyleColBandSize w:val="1"/>
       <w:tblCellMar>
-        <w:top w:w="0" w:type="dxa"/>
         <w:left w:w="108" w:type="dxa"/>
-        <w:bottom w:w="0" w:type="dxa"/>
         <w:right w:w="108" w:type="dxa"/>
       </w:tblCellMar>
     </w:tblPr>
@@ -9079,9 +9007,7 @@
       <w:tblStyleRowBandSize w:val="1"/>
       <w:tblStyleColBandSize w:val="1"/>
       <w:tblCellMar>
-        <w:top w:w="0" w:type="dxa"/>
         <w:left w:w="108" w:type="dxa"/>
-        <w:bottom w:w="0" w:type="dxa"/>
         <w:right w:w="108" w:type="dxa"/>
       </w:tblCellMar>
     </w:tblPr>
@@ -9095,9 +9021,7 @@
       <w:tblStyleRowBandSize w:val="1"/>
       <w:tblStyleColBandSize w:val="1"/>
       <w:tblCellMar>
-        <w:top w:w="0" w:type="dxa"/>
         <w:left w:w="108" w:type="dxa"/>
-        <w:bottom w:w="0" w:type="dxa"/>
         <w:right w:w="108" w:type="dxa"/>
       </w:tblCellMar>
     </w:tblPr>
@@ -9108,9 +9032,7 @@
       <w:tblStyleRowBandSize w:val="1"/>
       <w:tblStyleColBandSize w:val="1"/>
       <w:tblCellMar>
-        <w:top w:w="0" w:type="dxa"/>
         <w:left w:w="115" w:type="dxa"/>
-        <w:bottom w:w="0" w:type="dxa"/>
         <w:right w:w="115" w:type="dxa"/>
       </w:tblCellMar>
     </w:tblPr>
@@ -9121,9 +9043,7 @@
       <w:tblStyleRowBandSize w:val="1"/>
       <w:tblStyleColBandSize w:val="1"/>
       <w:tblCellMar>
-        <w:top w:w="0" w:type="dxa"/>
         <w:left w:w="115" w:type="dxa"/>
-        <w:bottom w:w="0" w:type="dxa"/>
         <w:right w:w="115" w:type="dxa"/>
       </w:tblCellMar>
     </w:tblPr>
@@ -9134,9 +9054,7 @@
       <w:tblStyleRowBandSize w:val="1"/>
       <w:tblStyleColBandSize w:val="1"/>
       <w:tblCellMar>
-        <w:top w:w="0" w:type="dxa"/>
         <w:left w:w="115" w:type="dxa"/>
-        <w:bottom w:w="0" w:type="dxa"/>
         <w:right w:w="115" w:type="dxa"/>
       </w:tblCellMar>
     </w:tblPr>
@@ -9147,9 +9065,7 @@
       <w:tblStyleRowBandSize w:val="1"/>
       <w:tblStyleColBandSize w:val="1"/>
       <w:tblCellMar>
-        <w:top w:w="0" w:type="dxa"/>
         <w:left w:w="115" w:type="dxa"/>
-        <w:bottom w:w="0" w:type="dxa"/>
         <w:right w:w="115" w:type="dxa"/>
       </w:tblCellMar>
     </w:tblPr>
@@ -9163,9 +9079,7 @@
       <w:tblStyleRowBandSize w:val="1"/>
       <w:tblStyleColBandSize w:val="1"/>
       <w:tblCellMar>
-        <w:top w:w="0" w:type="dxa"/>
         <w:left w:w="108" w:type="dxa"/>
-        <w:bottom w:w="0" w:type="dxa"/>
         <w:right w:w="108" w:type="dxa"/>
       </w:tblCellMar>
     </w:tblPr>
@@ -9179,9 +9093,7 @@
       <w:tblStyleRowBandSize w:val="1"/>
       <w:tblStyleColBandSize w:val="1"/>
       <w:tblCellMar>
-        <w:top w:w="0" w:type="dxa"/>
         <w:left w:w="108" w:type="dxa"/>
-        <w:bottom w:w="0" w:type="dxa"/>
         <w:right w:w="108" w:type="dxa"/>
       </w:tblCellMar>
     </w:tblPr>
@@ -9195,9 +9107,7 @@
       <w:tblStyleRowBandSize w:val="1"/>
       <w:tblStyleColBandSize w:val="1"/>
       <w:tblCellMar>
-        <w:top w:w="0" w:type="dxa"/>
         <w:left w:w="108" w:type="dxa"/>
-        <w:bottom w:w="0" w:type="dxa"/>
         <w:right w:w="108" w:type="dxa"/>
       </w:tblCellMar>
     </w:tblPr>
@@ -9211,9 +9121,7 @@
       <w:tblStyleRowBandSize w:val="1"/>
       <w:tblStyleColBandSize w:val="1"/>
       <w:tblCellMar>
-        <w:top w:w="0" w:type="dxa"/>
         <w:left w:w="108" w:type="dxa"/>
-        <w:bottom w:w="0" w:type="dxa"/>
         <w:right w:w="108" w:type="dxa"/>
       </w:tblCellMar>
     </w:tblPr>
@@ -9227,9 +9135,7 @@
       <w:tblStyleRowBandSize w:val="1"/>
       <w:tblStyleColBandSize w:val="1"/>
       <w:tblCellMar>
-        <w:top w:w="0" w:type="dxa"/>
         <w:left w:w="108" w:type="dxa"/>
-        <w:bottom w:w="0" w:type="dxa"/>
         <w:right w:w="108" w:type="dxa"/>
       </w:tblCellMar>
     </w:tblPr>
@@ -9243,9 +9149,7 @@
       <w:tblStyleRowBandSize w:val="1"/>
       <w:tblStyleColBandSize w:val="1"/>
       <w:tblCellMar>
-        <w:top w:w="0" w:type="dxa"/>
         <w:left w:w="108" w:type="dxa"/>
-        <w:bottom w:w="0" w:type="dxa"/>
         <w:right w:w="108" w:type="dxa"/>
       </w:tblCellMar>
     </w:tblPr>

</xml_diff>